<commit_message>
Fix Program 1 claims ledger and mobile navigation
</commit_message>
<xml_diff>
--- a/institutional/correctional/banking-credit/print/source-and-claims-ledger.docx
+++ b/institutional/correctional/banking-credit/print/source-and-claims-ledger.docx
@@ -175,7 +175,22 @@
         <w:t xml:space="preserve"> </w:t>
       </w:r>
       <w:r>
-        <w:t xml:space="preserve">About 68% of people released from state prison in 2005 (30 states) were arrested again within 3 years; 79% within 6 years. A later cohort (34 states, released 2012) showed 62% within 3 years. - Label:</w:t>
+        <w:t xml:space="preserve">About 68% of people released from state prison in 2005 (30 states) were arrested again within 3 years; 79% within 6 years. A later cohort (34 states, released 2012) showed 62% within 3 years.</w:t>
+      </w:r>
+    </w:p>
+    <w:p>
+      <w:pPr>
+        <w:numPr>
+          <w:ilvl w:val="0"/>
+          <w:numId w:val="1002"/>
+        </w:numPr>
+        <w:pStyle w:val="Compact"/>
+      </w:pPr>
+      <w:r>
+        <w:rPr>
+          <w:b/>
+        </w:rPr>
+        <w:t xml:space="preserve">Label:</w:t>
       </w:r>
       <w:r>
         <w:t xml:space="preserve"> </w:t>
@@ -186,16 +201,52 @@
         </w:rPr>
         <w:t xml:space="preserve">SOURCED</w:t>
       </w:r>
-      <w:r>
-        <w:t xml:space="preserve"> </w:t>
-      </w:r>
-      <w:r>
-        <w:t xml:space="preserve">- Source: U.S. Bureau of Justice Statistics (BJS), “2018 Update on Prisoner Recidivism: A 9-Year Follow-Up Period (2005–2014)”; and “Recidivism of Prisoners Released in 34 States in 2012.” - Careful wording: say “arrested again,” not “returned to prison.” Re-arrest is not the same as re-conviction or re-incarceration. Note the range (62%–68%) rather than one fixed number.</w:t>
-      </w:r>
-    </w:p>
-    <w:p>
-      <w:pPr>
-        <w:pStyle w:val="BodyText"/>
+    </w:p>
+    <w:p>
+      <w:pPr>
+        <w:numPr>
+          <w:ilvl w:val="0"/>
+          <w:numId w:val="1002"/>
+        </w:numPr>
+        <w:pStyle w:val="Compact"/>
+      </w:pPr>
+      <w:r>
+        <w:rPr>
+          <w:b/>
+        </w:rPr>
+        <w:t xml:space="preserve">Source:</w:t>
+      </w:r>
+      <w:r>
+        <w:t xml:space="preserve"> </w:t>
+      </w:r>
+      <w:r>
+        <w:t xml:space="preserve">U.S. Bureau of Justice Statistics (BJS), “2018 Update on Prisoner Recidivism: A 9-Year Follow-Up Period (2005–2014)”; and “Recidivism of Prisoners Released in 34 States in 2012.”</w:t>
+      </w:r>
+    </w:p>
+    <w:p>
+      <w:pPr>
+        <w:numPr>
+          <w:ilvl w:val="0"/>
+          <w:numId w:val="1002"/>
+        </w:numPr>
+        <w:pStyle w:val="Compact"/>
+      </w:pPr>
+      <w:r>
+        <w:rPr>
+          <w:b/>
+        </w:rPr>
+        <w:t xml:space="preserve">Careful wording:</w:t>
+      </w:r>
+      <w:r>
+        <w:t xml:space="preserve"> </w:t>
+      </w:r>
+      <w:r>
+        <w:t xml:space="preserve">say “arrested again,” not “returned to prison.” Re-arrest is not the same as re-conviction or re-incarceration. Note the range (62%–68%) rather than one fixed number.</w:t>
+      </w:r>
+    </w:p>
+    <w:p>
+      <w:pPr>
+        <w:pStyle w:val="FirstParagraph"/>
       </w:pPr>
       <w:r>
         <w:rPr>
@@ -207,27 +258,84 @@
         <w:t xml:space="preserve"> </w:t>
       </w:r>
       <w:r>
-        <w:t xml:space="preserve">People who could not hold a job after release had higher re-arrest rates than peers who stayed employed for a year. One analysis cites about 52% versus 16% over three years. - Label:</w:t>
-      </w:r>
-      <w:r>
-        <w:t xml:space="preserve"> </w:t>
-      </w:r>
-      <w:r>
-        <w:rPr>
-          <w:b/>
-        </w:rPr>
-        <w:t xml:space="preserve">SOURCED (as correlation, not proof of cause)</w:t>
-      </w:r>
-      <w:r>
-        <w:t xml:space="preserve"> </w:t>
-      </w:r>
-      <w:r>
-        <w:t xml:space="preserve">- Source: Prison Policy Initiative reentry research roundup; secondary employment-and-recidivism analyses. - Careful wording: this is a correlation. Employment and lower recidivism move together. Do not claim our program causes this gap.</w:t>
-      </w:r>
-    </w:p>
-    <w:p>
-      <w:pPr>
-        <w:pStyle w:val="BodyText"/>
+        <w:t xml:space="preserve">People who could not hold a job after release had higher re-arrest rates than peers who stayed employed for a year. One analysis cites about 52% versus 16% over three years.</w:t>
+      </w:r>
+    </w:p>
+    <w:p>
+      <w:pPr>
+        <w:numPr>
+          <w:ilvl w:val="0"/>
+          <w:numId w:val="1003"/>
+        </w:numPr>
+        <w:pStyle w:val="Compact"/>
+      </w:pPr>
+      <w:r>
+        <w:rPr>
+          <w:b/>
+        </w:rPr>
+        <w:t xml:space="preserve">Label:</w:t>
+      </w:r>
+      <w:r>
+        <w:t xml:space="preserve"> </w:t>
+      </w:r>
+      <w:r>
+        <w:rPr>
+          <w:b/>
+        </w:rPr>
+        <w:t xml:space="preserve">NEEDS SOURCE</w:t>
+      </w:r>
+      <w:r>
+        <w:t xml:space="preserve"> </w:t>
+      </w:r>
+      <w:r>
+        <w:t xml:space="preserve">(citation not firm)</w:t>
+      </w:r>
+    </w:p>
+    <w:p>
+      <w:pPr>
+        <w:numPr>
+          <w:ilvl w:val="0"/>
+          <w:numId w:val="1003"/>
+        </w:numPr>
+        <w:pStyle w:val="Compact"/>
+      </w:pPr>
+      <w:r>
+        <w:rPr>
+          <w:b/>
+        </w:rPr>
+        <w:t xml:space="preserve">Status:</w:t>
+      </w:r>
+      <w:r>
+        <w:t xml:space="preserve"> </w:t>
+      </w:r>
+      <w:r>
+        <w:t xml:space="preserve">The exact 52% versus 16% figure traces to secondary summaries, not a confirmed primary source. It is removed from all public and funder-facing copy until a primary source is confirmed. The grant one-pager and sales page do not use it.</w:t>
+      </w:r>
+    </w:p>
+    <w:p>
+      <w:pPr>
+        <w:numPr>
+          <w:ilvl w:val="0"/>
+          <w:numId w:val="1003"/>
+        </w:numPr>
+        <w:pStyle w:val="Compact"/>
+      </w:pPr>
+      <w:r>
+        <w:rPr>
+          <w:b/>
+        </w:rPr>
+        <w:t xml:space="preserve">Careful wording:</w:t>
+      </w:r>
+      <w:r>
+        <w:t xml:space="preserve"> </w:t>
+      </w:r>
+      <w:r>
+        <w:t xml:space="preserve">this is a correlation. Employment and lower recidivism move together. Do not claim our program causes this gap.</w:t>
+      </w:r>
+    </w:p>
+    <w:p>
+      <w:pPr>
+        <w:pStyle w:val="FirstParagraph"/>
       </w:pPr>
       <w:r>
         <w:rPr>
@@ -239,7 +347,22 @@
         <w:t xml:space="preserve"> </w:t>
       </w:r>
       <w:r>
-        <w:t xml:space="preserve">The unemployment rate among formerly incarcerated people has been estimated around 27%, far above the general population, with wide gaps by race and gender. - Label:</w:t>
+        <w:t xml:space="preserve">The unemployment rate among formerly incarcerated people has been estimated around 27%, far above the general population, with wide gaps by race and gender.</w:t>
+      </w:r>
+    </w:p>
+    <w:p>
+      <w:pPr>
+        <w:numPr>
+          <w:ilvl w:val="0"/>
+          <w:numId w:val="1004"/>
+        </w:numPr>
+        <w:pStyle w:val="Compact"/>
+      </w:pPr>
+      <w:r>
+        <w:rPr>
+          <w:b/>
+        </w:rPr>
+        <w:t xml:space="preserve">Label:</w:t>
       </w:r>
       <w:r>
         <w:t xml:space="preserve"> </w:t>
@@ -250,16 +373,31 @@
         </w:rPr>
         <w:t xml:space="preserve">SOURCED</w:t>
       </w:r>
-      <w:r>
-        <w:t xml:space="preserve"> </w:t>
-      </w:r>
-      <w:r>
-        <w:t xml:space="preserve">- Source: Prison Policy Initiative, “Out of Prison &amp; Out of Work.”</w:t>
-      </w:r>
-    </w:p>
-    <w:p>
-      <w:pPr>
-        <w:pStyle w:val="BodyText"/>
+    </w:p>
+    <w:p>
+      <w:pPr>
+        <w:numPr>
+          <w:ilvl w:val="0"/>
+          <w:numId w:val="1004"/>
+        </w:numPr>
+        <w:pStyle w:val="Compact"/>
+      </w:pPr>
+      <w:r>
+        <w:rPr>
+          <w:b/>
+        </w:rPr>
+        <w:t xml:space="preserve">Source:</w:t>
+      </w:r>
+      <w:r>
+        <w:t xml:space="preserve"> </w:t>
+      </w:r>
+      <w:r>
+        <w:t xml:space="preserve">Prison Policy Initiative, “Out of Prison &amp; Out of Work.”</w:t>
+      </w:r>
+    </w:p>
+    <w:p>
+      <w:pPr>
+        <w:pStyle w:val="FirstParagraph"/>
       </w:pPr>
       <w:r>
         <w:rPr>
@@ -271,7 +409,22 @@
         <w:t xml:space="preserve"> </w:t>
       </w:r>
       <w:r>
-        <w:t xml:space="preserve">Formerly incarcerated people are more likely to be unbanked than people who were never incarcerated. One survey found about 29% of justice-involved respondents were unbanked before incarceration, and unbanked status is common after release even among those banked before. - Label:</w:t>
+        <w:t xml:space="preserve">Formerly incarcerated people are more likely to be unbanked than people who were never incarcerated. One survey found about 29% of justice-involved respondents were unbanked before incarceration, and unbanked status is common after release even among those banked before.</w:t>
+      </w:r>
+    </w:p>
+    <w:p>
+      <w:pPr>
+        <w:numPr>
+          <w:ilvl w:val="0"/>
+          <w:numId w:val="1005"/>
+        </w:numPr>
+        <w:pStyle w:val="Compact"/>
+      </w:pPr>
+      <w:r>
+        <w:rPr>
+          <w:b/>
+        </w:rPr>
+        <w:t xml:space="preserve">Label:</w:t>
       </w:r>
       <w:r>
         <w:t xml:space="preserve"> </w:t>
@@ -282,16 +435,52 @@
         </w:rPr>
         <w:t xml:space="preserve">SOURCED</w:t>
       </w:r>
-      <w:r>
-        <w:t xml:space="preserve"> </w:t>
-      </w:r>
-      <w:r>
-        <w:t xml:space="preserve">- Source: Financial Health Network survey of justice-involved consumers; Rice University / Social Science Research study, “Locked out of banking” (2024). - Careful wording: use “more likely to be unbanked” and the ~29% figure. Do NOT use “78% without stable banking access” (see softened claims).</w:t>
-      </w:r>
-    </w:p>
-    <w:p>
-      <w:pPr>
-        <w:pStyle w:val="BodyText"/>
+    </w:p>
+    <w:p>
+      <w:pPr>
+        <w:numPr>
+          <w:ilvl w:val="0"/>
+          <w:numId w:val="1005"/>
+        </w:numPr>
+        <w:pStyle w:val="Compact"/>
+      </w:pPr>
+      <w:r>
+        <w:rPr>
+          <w:b/>
+        </w:rPr>
+        <w:t xml:space="preserve">Source:</w:t>
+      </w:r>
+      <w:r>
+        <w:t xml:space="preserve"> </w:t>
+      </w:r>
+      <w:r>
+        <w:t xml:space="preserve">Financial Health Network survey of justice-involved consumers; Rice University / Social Science Research study, “Locked out of banking” (2024).</w:t>
+      </w:r>
+    </w:p>
+    <w:p>
+      <w:pPr>
+        <w:numPr>
+          <w:ilvl w:val="0"/>
+          <w:numId w:val="1005"/>
+        </w:numPr>
+        <w:pStyle w:val="Compact"/>
+      </w:pPr>
+      <w:r>
+        <w:rPr>
+          <w:b/>
+        </w:rPr>
+        <w:t xml:space="preserve">Careful wording:</w:t>
+      </w:r>
+      <w:r>
+        <w:t xml:space="preserve"> </w:t>
+      </w:r>
+      <w:r>
+        <w:t xml:space="preserve">use “more likely to be unbanked” and the ~29% figure. Do NOT use “78% without stable banking access” (see softened claims).</w:t>
+      </w:r>
+    </w:p>
+    <w:p>
+      <w:pPr>
+        <w:pStyle w:val="FirstParagraph"/>
       </w:pPr>
       <w:r>
         <w:rPr>
@@ -303,7 +492,22 @@
         <w:t xml:space="preserve"> </w:t>
       </w:r>
       <w:r>
-        <w:t xml:space="preserve">In 2023, about 4.2% of U.S. households (around 5.6 million) were unbanked. - Label:</w:t>
+        <w:t xml:space="preserve">In 2023, about 4.2% of U.S. households (around 5.6 million) were unbanked.</w:t>
+      </w:r>
+    </w:p>
+    <w:p>
+      <w:pPr>
+        <w:numPr>
+          <w:ilvl w:val="0"/>
+          <w:numId w:val="1006"/>
+        </w:numPr>
+        <w:pStyle w:val="Compact"/>
+      </w:pPr>
+      <w:r>
+        <w:rPr>
+          <w:b/>
+        </w:rPr>
+        <w:t xml:space="preserve">Label:</w:t>
       </w:r>
       <w:r>
         <w:t xml:space="preserve"> </w:t>
@@ -314,11 +518,26 @@
         </w:rPr>
         <w:t xml:space="preserve">SOURCED</w:t>
       </w:r>
-      <w:r>
-        <w:t xml:space="preserve"> </w:t>
-      </w:r>
-      <w:r>
-        <w:t xml:space="preserve">- Source: FDIC, 2023 National Survey of Unbanked and Underbanked Households.</w:t>
+    </w:p>
+    <w:p>
+      <w:pPr>
+        <w:numPr>
+          <w:ilvl w:val="0"/>
+          <w:numId w:val="1006"/>
+        </w:numPr>
+        <w:pStyle w:val="Compact"/>
+      </w:pPr>
+      <w:r>
+        <w:rPr>
+          <w:b/>
+        </w:rPr>
+        <w:t xml:space="preserve">Source:</w:t>
+      </w:r>
+      <w:r>
+        <w:t xml:space="preserve"> </w:t>
+      </w:r>
+      <w:r>
+        <w:t xml:space="preserve">FDIC, 2023 National Survey of Unbanked and Underbanked Households.</w:t>
       </w:r>
     </w:p>
     <w:p>
@@ -348,11 +567,20 @@
         </w:rPr>
         <w:t xml:space="preserve">“Financial literacy reduces recidivism by 40%.”</w:t>
       </w:r>
-      <w:r>
-        <w:t xml:space="preserve"> </w:t>
-      </w:r>
-      <w:r>
-        <w:t xml:space="preserve">- Label:</w:t>
+    </w:p>
+    <w:p>
+      <w:pPr>
+        <w:numPr>
+          <w:ilvl w:val="0"/>
+          <w:numId w:val="1007"/>
+        </w:numPr>
+        <w:pStyle w:val="Compact"/>
+      </w:pPr>
+      <w:r>
+        <w:rPr>
+          <w:b/>
+        </w:rPr>
+        <w:t xml:space="preserve">Label:</w:t>
       </w:r>
       <w:r>
         <w:t xml:space="preserve"> </w:t>
@@ -363,16 +591,43 @@
         </w:rPr>
         <w:t xml:space="preserve">MARKETING TO SOFTEN: do not use.</w:t>
       </w:r>
-      <w:r>
-        <w:t xml:space="preserve"> </w:t>
-      </w:r>
-      <w:r>
-        <w:t xml:space="preserve">- No direct credible source found for this exact figure. The current FSA correctional page uses “40% lower recidivism with financial literacy programs” in its stats row. Remove it. - Replace with: “Financial education can support reentry by improving money skills, reducing reliance on predatory services, and helping participants navigate employment, debt, banking, and benefits. Research links stable employment and financial stability to lower re-arrest rates, though no single program guarantees a specific drop in recidivism.”</w:t>
-      </w:r>
-    </w:p>
-    <w:p>
-      <w:pPr>
-        <w:pStyle w:val="BodyText"/>
+    </w:p>
+    <w:p>
+      <w:pPr>
+        <w:numPr>
+          <w:ilvl w:val="0"/>
+          <w:numId w:val="1007"/>
+        </w:numPr>
+        <w:pStyle w:val="Compact"/>
+      </w:pPr>
+      <w:r>
+        <w:t xml:space="preserve">No direct credible source found for this exact figure. The current FSA correctional page uses “40% lower recidivism with financial literacy programs” in its stats row. Remove it.</w:t>
+      </w:r>
+    </w:p>
+    <w:p>
+      <w:pPr>
+        <w:numPr>
+          <w:ilvl w:val="0"/>
+          <w:numId w:val="1007"/>
+        </w:numPr>
+        <w:pStyle w:val="Compact"/>
+      </w:pPr>
+      <w:r>
+        <w:rPr>
+          <w:b/>
+        </w:rPr>
+        <w:t xml:space="preserve">Replace with:</w:t>
+      </w:r>
+      <w:r>
+        <w:t xml:space="preserve"> </w:t>
+      </w:r>
+      <w:r>
+        <w:t xml:space="preserve">“Financial education can support reentry by improving money skills, reducing reliance on predatory services, and helping participants navigate employment, debt, banking, and benefits. Research links stable employment and financial stability to lower re-arrest rates, though no single program guarantees a specific drop in recidivism.”</w:t>
+      </w:r>
+    </w:p>
+    <w:p>
+      <w:pPr>
+        <w:pStyle w:val="FirstParagraph"/>
       </w:pPr>
       <w:r>
         <w:rPr>
@@ -380,11 +635,20 @@
         </w:rPr>
         <w:t xml:space="preserve">“78% of returning citizens without stable banking access.”</w:t>
       </w:r>
-      <w:r>
-        <w:t xml:space="preserve"> </w:t>
-      </w:r>
-      <w:r>
-        <w:t xml:space="preserve">- Label:</w:t>
+    </w:p>
+    <w:p>
+      <w:pPr>
+        <w:numPr>
+          <w:ilvl w:val="0"/>
+          <w:numId w:val="1008"/>
+        </w:numPr>
+        <w:pStyle w:val="Compact"/>
+      </w:pPr>
+      <w:r>
+        <w:rPr>
+          <w:b/>
+        </w:rPr>
+        <w:t xml:space="preserve">Label:</w:t>
       </w:r>
       <w:r>
         <w:t xml:space="preserve"> </w:t>
@@ -395,16 +659,22 @@
         </w:rPr>
         <w:t xml:space="preserve">MARKETING TO SOFTEN: no direct source found.</w:t>
       </w:r>
-      <w:r>
-        <w:t xml:space="preserve"> </w:t>
-      </w:r>
-      <w:r>
-        <w:t xml:space="preserve">- Replace with the sourced banking claim above: formerly incarcerated people are more likely to be unbanked, with around 29% unbanked even before incarceration, and unbanked status common after release.</w:t>
-      </w:r>
-    </w:p>
-    <w:p>
-      <w:pPr>
-        <w:pStyle w:val="BodyText"/>
+    </w:p>
+    <w:p>
+      <w:pPr>
+        <w:numPr>
+          <w:ilvl w:val="0"/>
+          <w:numId w:val="1008"/>
+        </w:numPr>
+        <w:pStyle w:val="Compact"/>
+      </w:pPr>
+      <w:r>
+        <w:t xml:space="preserve">Replace with the sourced banking claim above: formerly incarcerated people are more likely to be unbanked, with around 29% unbanked even before incarceration, and unbanked status common after release.</w:t>
+      </w:r>
+    </w:p>
+    <w:p>
+      <w:pPr>
+        <w:pStyle w:val="FirstParagraph"/>
       </w:pPr>
       <w:r>
         <w:rPr>
@@ -412,11 +682,20 @@
         </w:rPr>
         <w:t xml:space="preserve">“Over two-thirds return to prison within 3 years.”</w:t>
       </w:r>
-      <w:r>
-        <w:t xml:space="preserve"> </w:t>
-      </w:r>
-      <w:r>
-        <w:t xml:space="preserve">- Label:</w:t>
+    </w:p>
+    <w:p>
+      <w:pPr>
+        <w:numPr>
+          <w:ilvl w:val="0"/>
+          <w:numId w:val="1009"/>
+        </w:numPr>
+        <w:pStyle w:val="Compact"/>
+      </w:pPr>
+      <w:r>
+        <w:rPr>
+          <w:b/>
+        </w:rPr>
+        <w:t xml:space="preserve">Label:</w:t>
       </w:r>
       <w:r>
         <w:t xml:space="preserve"> </w:t>
@@ -427,16 +706,22 @@
         </w:rPr>
         <w:t xml:space="preserve">NEEDS SOURCE as written / SOFTEN wording.</w:t>
       </w:r>
-      <w:r>
-        <w:t xml:space="preserve"> </w:t>
-      </w:r>
-      <w:r>
-        <w:t xml:space="preserve">- The two-thirds figure is for re-arrest, not return to prison. Replace “return to prison” with “are arrested again.”</w:t>
-      </w:r>
-    </w:p>
-    <w:p>
-      <w:pPr>
-        <w:pStyle w:val="BodyText"/>
+    </w:p>
+    <w:p>
+      <w:pPr>
+        <w:numPr>
+          <w:ilvl w:val="0"/>
+          <w:numId w:val="1009"/>
+        </w:numPr>
+        <w:pStyle w:val="Compact"/>
+      </w:pPr>
+      <w:r>
+        <w:t xml:space="preserve">The two-thirds figure is for re-arrest, not return to prison. Replace “return to prison” with “are arrested again.”</w:t>
+      </w:r>
+    </w:p>
+    <w:p>
+      <w:pPr>
+        <w:pStyle w:val="FirstParagraph"/>
       </w:pPr>
       <w:r>
         <w:rPr>
@@ -444,11 +729,20 @@
         </w:rPr>
         <w:t xml:space="preserve">“Break the financial cycle” / “Reduce recidivism through financial education” (headline promises).</w:t>
       </w:r>
-      <w:r>
-        <w:t xml:space="preserve"> </w:t>
-      </w:r>
-      <w:r>
-        <w:t xml:space="preserve">- Label:</w:t>
+    </w:p>
+    <w:p>
+      <w:pPr>
+        <w:numPr>
+          <w:ilvl w:val="0"/>
+          <w:numId w:val="1010"/>
+        </w:numPr>
+        <w:pStyle w:val="Compact"/>
+      </w:pPr>
+      <w:r>
+        <w:rPr>
+          <w:b/>
+        </w:rPr>
+        <w:t xml:space="preserve">Label:</w:t>
       </w:r>
       <w:r>
         <w:t xml:space="preserve"> </w:t>
@@ -459,11 +753,17 @@
         </w:rPr>
         <w:t xml:space="preserve">MARKETING TO SOFTEN.</w:t>
       </w:r>
-      <w:r>
-        <w:t xml:space="preserve"> </w:t>
-      </w:r>
-      <w:r>
-        <w:t xml:space="preserve">- Keep as motivation, not as a measured promise. Pair any recidivism mention with the softened language above. Never state a guaranteed percentage outcome.</w:t>
+    </w:p>
+    <w:p>
+      <w:pPr>
+        <w:numPr>
+          <w:ilvl w:val="0"/>
+          <w:numId w:val="1010"/>
+        </w:numPr>
+        <w:pStyle w:val="Compact"/>
+      </w:pPr>
+      <w:r>
+        <w:t xml:space="preserve">Keep as motivation, not as a measured promise. Pair any recidivism mention with the softened language above. Never state a guaranteed percentage outcome.</w:t>
       </w:r>
     </w:p>
     <w:p>
@@ -487,7 +787,7 @@
       <w:pPr>
         <w:numPr>
           <w:ilvl w:val="0"/>
-          <w:numId w:val="1002"/>
+          <w:numId w:val="1011"/>
         </w:numPr>
         <w:pStyle w:val="Compact"/>
       </w:pPr>
@@ -514,7 +814,7 @@
       <w:pPr>
         <w:numPr>
           <w:ilvl w:val="0"/>
-          <w:numId w:val="1002"/>
+          <w:numId w:val="1011"/>
         </w:numPr>
         <w:pStyle w:val="Compact"/>
       </w:pPr>
@@ -541,7 +841,7 @@
       <w:pPr>
         <w:numPr>
           <w:ilvl w:val="0"/>
-          <w:numId w:val="1002"/>
+          <w:numId w:val="1011"/>
         </w:numPr>
         <w:pStyle w:val="Compact"/>
       </w:pPr>
@@ -568,7 +868,7 @@
       <w:pPr>
         <w:numPr>
           <w:ilvl w:val="0"/>
-          <w:numId w:val="1002"/>
+          <w:numId w:val="1011"/>
         </w:numPr>
         <w:pStyle w:val="Compact"/>
       </w:pPr>
@@ -609,7 +909,7 @@
       <w:pPr>
         <w:numPr>
           <w:ilvl w:val="0"/>
-          <w:numId w:val="1003"/>
+          <w:numId w:val="1012"/>
         </w:numPr>
         <w:pStyle w:val="Compact"/>
       </w:pPr>
@@ -630,7 +930,7 @@
       <w:pPr>
         <w:numPr>
           <w:ilvl w:val="0"/>
-          <w:numId w:val="1003"/>
+          <w:numId w:val="1012"/>
         </w:numPr>
         <w:pStyle w:val="Compact"/>
       </w:pPr>
@@ -654,7 +954,7 @@
       <w:pPr>
         <w:numPr>
           <w:ilvl w:val="0"/>
-          <w:numId w:val="1003"/>
+          <w:numId w:val="1012"/>
         </w:numPr>
         <w:pStyle w:val="Compact"/>
       </w:pPr>
@@ -692,7 +992,7 @@
       <w:pPr>
         <w:numPr>
           <w:ilvl w:val="0"/>
-          <w:numId w:val="1004"/>
+          <w:numId w:val="1013"/>
         </w:numPr>
         <w:pStyle w:val="Compact"/>
       </w:pPr>
@@ -704,7 +1004,7 @@
       <w:pPr>
         <w:numPr>
           <w:ilvl w:val="0"/>
-          <w:numId w:val="1004"/>
+          <w:numId w:val="1013"/>
         </w:numPr>
         <w:pStyle w:val="Compact"/>
       </w:pPr>
@@ -716,7 +1016,7 @@
       <w:pPr>
         <w:numPr>
           <w:ilvl w:val="0"/>
-          <w:numId w:val="1004"/>
+          <w:numId w:val="1013"/>
         </w:numPr>
         <w:pStyle w:val="Compact"/>
       </w:pPr>
@@ -728,7 +1028,7 @@
       <w:pPr>
         <w:numPr>
           <w:ilvl w:val="0"/>
-          <w:numId w:val="1004"/>
+          <w:numId w:val="1013"/>
         </w:numPr>
         <w:pStyle w:val="Compact"/>
       </w:pPr>
@@ -740,7 +1040,7 @@
       <w:pPr>
         <w:numPr>
           <w:ilvl w:val="0"/>
-          <w:numId w:val="1004"/>
+          <w:numId w:val="1013"/>
         </w:numPr>
         <w:pStyle w:val="Compact"/>
       </w:pPr>
@@ -752,7 +1052,7 @@
       <w:pPr>
         <w:numPr>
           <w:ilvl w:val="0"/>
-          <w:numId w:val="1004"/>
+          <w:numId w:val="1013"/>
         </w:numPr>
         <w:pStyle w:val="Compact"/>
       </w:pPr>
@@ -1142,6 +1442,33 @@
     <w:abstractNumId w:val="991"/>
   </w:num>
   <w:num w:numId="1004">
+    <w:abstractNumId w:val="991"/>
+  </w:num>
+  <w:num w:numId="1005">
+    <w:abstractNumId w:val="991"/>
+  </w:num>
+  <w:num w:numId="1006">
+    <w:abstractNumId w:val="991"/>
+  </w:num>
+  <w:num w:numId="1007">
+    <w:abstractNumId w:val="991"/>
+  </w:num>
+  <w:num w:numId="1008">
+    <w:abstractNumId w:val="991"/>
+  </w:num>
+  <w:num w:numId="1009">
+    <w:abstractNumId w:val="991"/>
+  </w:num>
+  <w:num w:numId="1010">
+    <w:abstractNumId w:val="991"/>
+  </w:num>
+  <w:num w:numId="1011">
+    <w:abstractNumId w:val="991"/>
+  </w:num>
+  <w:num w:numId="1012">
+    <w:abstractNumId w:val="991"/>
+  </w:num>
+  <w:num w:numId="1013">
     <w:abstractNumId w:val="99401"/>
     <w:lvlOverride w:ilvl="0">
       <w:startOverride w:val="1"/>

</xml_diff>